<commit_message>
Fixes inconsistency on TA form
</commit_message>
<xml_diff>
--- a/content/support-access/access/Cirrus-TA-PumpPriming-form.docx
+++ b/content/support-access/access/Cirrus-TA-PumpPriming-form.docx
@@ -91,7 +91,7 @@
                         <a:effectLst/>
                         <a:extLst>
                           <a:ext uri="{C572A759-6A51-4108-AA02-DFA0A04FC94B}">
-                            <ma14:wrappingTextBoxFlag xmlns:ma14="http://schemas.microsoft.com/office/mac/drawingml/2011/main" xmlns:w="http://schemas.openxmlformats.org/wordprocessingml/2006/main" xmlns:w10="urn:schemas-microsoft-com:office:word" xmlns:v="urn:schemas-microsoft-com:vml" xmlns:o="urn:schemas-microsoft-com:office:office" xmlns:mv="urn:schemas-microsoft-com:mac:vml" xmlns:mo="http://schemas.microsoft.com/office/mac/office/2008/main" xmlns=""/>
+                            <ma14:wrappingTextBoxFlag xmlns="" xmlns:mo="http://schemas.microsoft.com/office/mac/office/2008/main" xmlns:mv="urn:schemas-microsoft-com:mac:vml" xmlns:o="urn:schemas-microsoft-com:office:office" xmlns:v="urn:schemas-microsoft-com:vml" xmlns:w10="urn:schemas-microsoft-com:office:word" xmlns:w="http://schemas.openxmlformats.org/wordprocessingml/2006/main" xmlns:ma14="http://schemas.microsoft.com/office/mac/drawingml/2011/main"/>
                           </a:ext>
                         </a:extLst>
                       </wps:spPr>
@@ -3212,7 +3212,21 @@
           <w:rFonts w:asciiTheme="minorHAnsi" w:hAnsiTheme="minorHAnsi" w:cs="Arial"/>
           <w:highlight w:val="cyan"/>
         </w:rPr>
-        <w:t>[Specify disk space requirements if larger than 500 GiB]</w:t>
+        <w:t xml:space="preserve">[Specify disk space requirements if larger than </w:t>
+      </w:r>
+      <w:r>
+        <w:rPr>
+          <w:rFonts w:asciiTheme="minorHAnsi" w:hAnsiTheme="minorHAnsi" w:cs="Arial"/>
+          <w:highlight w:val="cyan"/>
+        </w:rPr>
+        <w:t>250</w:t>
+      </w:r>
+      <w:r>
+        <w:rPr>
+          <w:rFonts w:asciiTheme="minorHAnsi" w:hAnsiTheme="minorHAnsi" w:cs="Arial"/>
+          <w:highlight w:val="cyan"/>
+        </w:rPr>
+        <w:t xml:space="preserve"> GiB]</w:t>
       </w:r>
     </w:p>
     <w:p>

</xml_diff>